<commit_message>
Completed executive dashboard data preparation and KPI exports
</commit_message>
<xml_diff>
--- a/screenshots/03_Executive_Dashboard_Data_Prep.ipynb_Screenshots.docx
+++ b/screenshots/03_Executive_Dashboard_Data_Prep.ipynb_Screenshots.docx
@@ -58,7 +58,7 @@
           <w:b/>
           <w:bCs/>
         </w:rPr>
-        <w:t>3</w:t>
+        <w:t>6</w:t>
       </w:r>
       <w:r>
         <w:rPr>
@@ -66,7 +66,7 @@
           <w:bCs/>
           <w:vertAlign w:val="superscript"/>
         </w:rPr>
-        <w:t>rd</w:t>
+        <w:t>th</w:t>
       </w:r>
       <w:r>
         <w:rPr>
@@ -80,6 +80,13 @@
           <w:b/>
           <w:bCs/>
         </w:rPr>
+        <w:t xml:space="preserve"> </w:t>
+      </w:r>
+      <w:r>
+        <w:rPr>
+          <w:b/>
+          <w:bCs/>
+        </w:rPr>
         <w:t>Oct 2026</w:t>
       </w:r>
       <w:r>
@@ -87,7 +94,14 @@
           <w:b/>
           <w:bCs/>
         </w:rPr>
-        <w:t xml:space="preserve"> 6:30 AM</w:t>
+        <w:t xml:space="preserve"> 6:30 </w:t>
+      </w:r>
+      <w:r>
+        <w:rPr>
+          <w:b/>
+          <w:bCs/>
+        </w:rPr>
+        <w:t>PM</w:t>
       </w:r>
     </w:p>
     <w:p>
@@ -108,12 +122,14 @@
     <w:p>
       <w:pPr>
         <w:rPr>
-          <w:b/>
-          <w:bCs/>
-        </w:rPr>
-      </w:pPr>
-      <w:r>
-        <w:rPr>
+          <w:rFonts w:ascii="Segoe UI Emoji" w:hAnsi="Segoe UI Emoji" w:cs="Segoe UI Emoji"/>
+          <w:b/>
+          <w:bCs/>
+        </w:rPr>
+      </w:pPr>
+      <w:r>
+        <w:rPr>
+          <w:rFonts w:ascii="Arial" w:hAnsi="Arial" w:cs="Arial"/>
           <w:b/>
           <w:bCs/>
         </w:rPr>
@@ -123,6 +139,7 @@
     <w:p>
       <w:pPr>
         <w:rPr>
+          <w:rFonts w:ascii="Segoe UI Emoji" w:hAnsi="Segoe UI Emoji" w:cs="Segoe UI Emoji"/>
           <w:b/>
           <w:bCs/>
         </w:rPr>
@@ -137,6 +154,7 @@
       </w:r>
       <w:r>
         <w:rPr>
+          <w:rFonts w:ascii="Segoe UI Emoji" w:hAnsi="Segoe UI Emoji" w:cs="Segoe UI Emoji"/>
           <w:b/>
           <w:bCs/>
         </w:rPr>
@@ -146,6 +164,7 @@
     <w:p>
       <w:pPr>
         <w:rPr>
+          <w:rFonts w:ascii="Segoe UI Emoji" w:hAnsi="Segoe UI Emoji" w:cs="Segoe UI Emoji"/>
           <w:b/>
           <w:bCs/>
         </w:rPr>
@@ -160,6 +179,7 @@
       </w:r>
       <w:r>
         <w:rPr>
+          <w:rFonts w:ascii="Segoe UI Emoji" w:hAnsi="Segoe UI Emoji" w:cs="Segoe UI Emoji"/>
           <w:b/>
           <w:bCs/>
         </w:rPr>
@@ -169,6 +189,7 @@
     <w:p>
       <w:pPr>
         <w:rPr>
+          <w:rFonts w:ascii="Segoe UI Emoji" w:hAnsi="Segoe UI Emoji" w:cs="Segoe UI Emoji"/>
           <w:b/>
           <w:bCs/>
         </w:rPr>
@@ -183,6 +204,7 @@
       </w:r>
       <w:r>
         <w:rPr>
+          <w:rFonts w:ascii="Segoe UI Emoji" w:hAnsi="Segoe UI Emoji" w:cs="Segoe UI Emoji"/>
           <w:b/>
           <w:bCs/>
         </w:rPr>
@@ -192,6 +214,7 @@
     <w:p>
       <w:pPr>
         <w:rPr>
+          <w:rFonts w:ascii="Segoe UI Emoji" w:hAnsi="Segoe UI Emoji" w:cs="Segoe UI Emoji"/>
           <w:b/>
           <w:bCs/>
         </w:rPr>
@@ -206,6 +229,7 @@
       </w:r>
       <w:r>
         <w:rPr>
+          <w:rFonts w:ascii="Segoe UI Emoji" w:hAnsi="Segoe UI Emoji" w:cs="Segoe UI Emoji"/>
           <w:b/>
           <w:bCs/>
         </w:rPr>
@@ -215,6 +239,7 @@
     <w:p>
       <w:pPr>
         <w:rPr>
+          <w:rFonts w:ascii="Segoe UI Emoji" w:hAnsi="Segoe UI Emoji" w:cs="Segoe UI Emoji"/>
           <w:b/>
           <w:bCs/>
         </w:rPr>
@@ -229,6 +254,7 @@
       </w:r>
       <w:r>
         <w:rPr>
+          <w:rFonts w:ascii="Segoe UI Emoji" w:hAnsi="Segoe UI Emoji" w:cs="Segoe UI Emoji"/>
           <w:b/>
           <w:bCs/>
         </w:rPr>
@@ -238,6 +264,7 @@
     <w:p>
       <w:pPr>
         <w:rPr>
+          <w:rFonts w:ascii="Segoe UI Emoji" w:hAnsi="Segoe UI Emoji" w:cs="Segoe UI Emoji"/>
           <w:b/>
           <w:bCs/>
         </w:rPr>
@@ -252,6 +279,7 @@
       </w:r>
       <w:r>
         <w:rPr>
+          <w:rFonts w:ascii="Segoe UI Emoji" w:hAnsi="Segoe UI Emoji" w:cs="Segoe UI Emoji"/>
           <w:b/>
           <w:bCs/>
         </w:rPr>
@@ -261,6 +289,7 @@
     <w:p>
       <w:pPr>
         <w:rPr>
+          <w:rFonts w:ascii="Segoe UI Emoji" w:hAnsi="Segoe UI Emoji" w:cs="Segoe UI Emoji"/>
           <w:b/>
           <w:bCs/>
         </w:rPr>
@@ -275,6 +304,7 @@
       </w:r>
       <w:r>
         <w:rPr>
+          <w:rFonts w:ascii="Segoe UI Emoji" w:hAnsi="Segoe UI Emoji" w:cs="Segoe UI Emoji"/>
           <w:b/>
           <w:bCs/>
         </w:rPr>
@@ -284,6 +314,7 @@
     <w:p>
       <w:pPr>
         <w:rPr>
+          <w:rFonts w:ascii="Segoe UI Emoji" w:hAnsi="Segoe UI Emoji" w:cs="Segoe UI Emoji"/>
           <w:b/>
           <w:bCs/>
         </w:rPr>
@@ -298,6 +329,7 @@
       </w:r>
       <w:r>
         <w:rPr>
+          <w:rFonts w:ascii="Segoe UI Emoji" w:hAnsi="Segoe UI Emoji" w:cs="Segoe UI Emoji"/>
           <w:b/>
           <w:bCs/>
         </w:rPr>
@@ -307,6 +339,7 @@
     <w:p>
       <w:pPr>
         <w:rPr>
+          <w:rFonts w:ascii="Segoe UI Emoji" w:hAnsi="Segoe UI Emoji" w:cs="Segoe UI Emoji"/>
           <w:b/>
           <w:bCs/>
         </w:rPr>
@@ -321,6 +354,7 @@
       </w:r>
       <w:r>
         <w:rPr>
+          <w:rFonts w:ascii="Segoe UI Emoji" w:hAnsi="Segoe UI Emoji" w:cs="Segoe UI Emoji"/>
           <w:b/>
           <w:bCs/>
         </w:rPr>
@@ -330,6 +364,7 @@
     <w:p>
       <w:pPr>
         <w:rPr>
+          <w:rFonts w:ascii="Segoe UI Emoji" w:hAnsi="Segoe UI Emoji" w:cs="Segoe UI Emoji"/>
           <w:b/>
           <w:bCs/>
         </w:rPr>
@@ -344,6 +379,7 @@
       </w:r>
       <w:r>
         <w:rPr>
+          <w:rFonts w:ascii="Segoe UI Emoji" w:hAnsi="Segoe UI Emoji" w:cs="Segoe UI Emoji"/>
           <w:b/>
           <w:bCs/>
         </w:rPr>
@@ -353,6 +389,7 @@
     <w:p>
       <w:pPr>
         <w:rPr>
+          <w:rFonts w:ascii="Segoe UI Emoji" w:hAnsi="Segoe UI Emoji" w:cs="Segoe UI Emoji"/>
           <w:b/>
           <w:bCs/>
         </w:rPr>
@@ -367,6 +404,7 @@
       </w:r>
       <w:r>
         <w:rPr>
+          <w:rFonts w:ascii="Segoe UI Emoji" w:hAnsi="Segoe UI Emoji" w:cs="Segoe UI Emoji"/>
           <w:b/>
           <w:bCs/>
         </w:rPr>
@@ -376,6 +414,7 @@
     <w:p>
       <w:pPr>
         <w:rPr>
+          <w:rFonts w:ascii="Segoe UI Emoji" w:hAnsi="Segoe UI Emoji" w:cs="Segoe UI Emoji"/>
           <w:b/>
           <w:bCs/>
         </w:rPr>
@@ -390,6 +429,7 @@
       </w:r>
       <w:r>
         <w:rPr>
+          <w:rFonts w:ascii="Segoe UI Emoji" w:hAnsi="Segoe UI Emoji" w:cs="Segoe UI Emoji"/>
           <w:b/>
           <w:bCs/>
         </w:rPr>
@@ -399,6 +439,7 @@
     <w:p>
       <w:pPr>
         <w:rPr>
+          <w:rFonts w:ascii="Segoe UI Emoji" w:hAnsi="Segoe UI Emoji" w:cs="Segoe UI Emoji"/>
           <w:b/>
           <w:bCs/>
         </w:rPr>
@@ -413,6 +454,7 @@
       </w:r>
       <w:r>
         <w:rPr>
+          <w:rFonts w:ascii="Segoe UI Emoji" w:hAnsi="Segoe UI Emoji" w:cs="Segoe UI Emoji"/>
           <w:b/>
           <w:bCs/>
         </w:rPr>
@@ -422,6 +464,7 @@
     <w:p>
       <w:pPr>
         <w:rPr>
+          <w:rFonts w:ascii="Segoe UI Emoji" w:hAnsi="Segoe UI Emoji" w:cs="Segoe UI Emoji"/>
           <w:b/>
           <w:bCs/>
         </w:rPr>
@@ -436,6 +479,7 @@
       </w:r>
       <w:r>
         <w:rPr>
+          <w:rFonts w:ascii="Segoe UI Emoji" w:hAnsi="Segoe UI Emoji" w:cs="Segoe UI Emoji"/>
           <w:b/>
           <w:bCs/>
         </w:rPr>
@@ -445,6 +489,7 @@
     <w:p>
       <w:pPr>
         <w:rPr>
+          <w:rFonts w:ascii="Segoe UI Emoji" w:hAnsi="Segoe UI Emoji" w:cs="Segoe UI Emoji"/>
           <w:b/>
           <w:bCs/>
         </w:rPr>
@@ -459,6 +504,7 @@
       </w:r>
       <w:r>
         <w:rPr>
+          <w:rFonts w:ascii="Segoe UI Emoji" w:hAnsi="Segoe UI Emoji" w:cs="Segoe UI Emoji"/>
           <w:b/>
           <w:bCs/>
         </w:rPr>
@@ -468,6 +514,7 @@
     <w:p>
       <w:pPr>
         <w:rPr>
+          <w:rFonts w:ascii="Segoe UI Emoji" w:hAnsi="Segoe UI Emoji" w:cs="Segoe UI Emoji"/>
           <w:b/>
           <w:bCs/>
         </w:rPr>
@@ -482,6 +529,7 @@
       </w:r>
       <w:r>
         <w:rPr>
+          <w:rFonts w:ascii="Segoe UI Emoji" w:hAnsi="Segoe UI Emoji" w:cs="Segoe UI Emoji"/>
           <w:b/>
           <w:bCs/>
         </w:rPr>
@@ -495,44 +543,358 @@
           <w:bCs/>
         </w:rPr>
       </w:pPr>
-    </w:p>
-    <w:p>
-      <w:pPr>
-        <w:rPr>
-          <w:b/>
-          <w:bCs/>
-        </w:rPr>
-      </w:pPr>
-    </w:p>
-    <w:p>
-      <w:pPr>
-        <w:rPr>
-          <w:b/>
-          <w:bCs/>
-        </w:rPr>
-      </w:pPr>
-    </w:p>
-    <w:p>
-      <w:pPr>
-        <w:rPr>
-          <w:b/>
-          <w:bCs/>
-        </w:rPr>
-      </w:pPr>
-    </w:p>
-    <w:p>
-      <w:pPr>
-        <w:rPr>
-          <w:b/>
-          <w:bCs/>
-        </w:rPr>
-      </w:pPr>
-      <w:r>
-        <w:rPr>
+      <w:r>
+        <w:rPr>
+          <w:rFonts w:ascii="Segoe UI Emoji" w:hAnsi="Segoe UI Emoji" w:cs="Segoe UI Emoji"/>
+          <w:b/>
+          <w:bCs/>
+        </w:rPr>
+        <w:t>✅</w:t>
+      </w:r>
+      <w:r>
+        <w:rPr>
+          <w:b/>
+          <w:bCs/>
+        </w:rPr>
+        <w:t xml:space="preserve"> Dataset loaded successfully</w:t>
+      </w:r>
+      <w:r>
+        <w:rPr>
+          <w:b/>
+          <w:bCs/>
+        </w:rPr>
+        <w:br/>
+      </w:r>
+      <w:r>
+        <w:rPr>
+          <w:rFonts w:ascii="Segoe UI Emoji" w:hAnsi="Segoe UI Emoji" w:cs="Segoe UI Emoji"/>
+          <w:b/>
+          <w:bCs/>
+        </w:rPr>
+        <w:t>✅</w:t>
+      </w:r>
+      <w:r>
+        <w:rPr>
+          <w:b/>
+          <w:bCs/>
+        </w:rPr>
+        <w:t xml:space="preserve"> KPI Summary created</w:t>
+      </w:r>
+      <w:r>
+        <w:rPr>
+          <w:b/>
+          <w:bCs/>
+        </w:rPr>
+        <w:br/>
+      </w:r>
+      <w:r>
+        <w:rPr>
+          <w:rFonts w:ascii="Segoe UI Emoji" w:hAnsi="Segoe UI Emoji" w:cs="Segoe UI Emoji"/>
+          <w:b/>
+          <w:bCs/>
+        </w:rPr>
+        <w:t>✅</w:t>
+      </w:r>
+      <w:r>
+        <w:rPr>
+          <w:b/>
+          <w:bCs/>
+        </w:rPr>
+        <w:t xml:space="preserve"> Product Summary created</w:t>
+      </w:r>
+      <w:r>
+        <w:rPr>
+          <w:b/>
+          <w:bCs/>
+        </w:rPr>
+        <w:br/>
+      </w:r>
+      <w:r>
+        <w:rPr>
+          <w:rFonts w:ascii="Segoe UI Emoji" w:hAnsi="Segoe UI Emoji" w:cs="Segoe UI Emoji"/>
+          <w:b/>
+          <w:bCs/>
+        </w:rPr>
+        <w:t>✅</w:t>
+      </w:r>
+      <w:r>
+        <w:rPr>
+          <w:b/>
+          <w:bCs/>
+        </w:rPr>
+        <w:t xml:space="preserve"> Category Summary created</w:t>
+      </w:r>
+      <w:r>
+        <w:rPr>
+          <w:b/>
+          <w:bCs/>
+        </w:rPr>
+        <w:br/>
+      </w:r>
+      <w:r>
+        <w:rPr>
+          <w:rFonts w:ascii="Segoe UI Emoji" w:hAnsi="Segoe UI Emoji" w:cs="Segoe UI Emoji"/>
+          <w:b/>
+          <w:bCs/>
+        </w:rPr>
+        <w:t>✅</w:t>
+      </w:r>
+      <w:r>
+        <w:rPr>
+          <w:b/>
+          <w:bCs/>
+        </w:rPr>
+        <w:t xml:space="preserve"> Store Summary created</w:t>
+      </w:r>
+      <w:r>
+        <w:rPr>
+          <w:b/>
+          <w:bCs/>
+        </w:rPr>
+        <w:br/>
+      </w:r>
+      <w:r>
+        <w:rPr>
+          <w:rFonts w:ascii="Segoe UI Emoji" w:hAnsi="Segoe UI Emoji" w:cs="Segoe UI Emoji"/>
           <w:b/>
           <w:bCs/>
         </w:rPr>
         <w:lastRenderedPageBreak/>
+        <w:t>✅</w:t>
+      </w:r>
+      <w:r>
+        <w:rPr>
+          <w:b/>
+          <w:bCs/>
+        </w:rPr>
+        <w:t xml:space="preserve"> Monthly Trend created</w:t>
+      </w:r>
+      <w:r>
+        <w:rPr>
+          <w:b/>
+          <w:bCs/>
+        </w:rPr>
+        <w:br/>
+      </w:r>
+      <w:r>
+        <w:rPr>
+          <w:rFonts w:ascii="Segoe UI Emoji" w:hAnsi="Segoe UI Emoji" w:cs="Segoe UI Emoji"/>
+          <w:b/>
+          <w:bCs/>
+        </w:rPr>
+        <w:t>✅</w:t>
+      </w:r>
+      <w:r>
+        <w:rPr>
+          <w:b/>
+          <w:bCs/>
+        </w:rPr>
+        <w:t xml:space="preserve"> Files exported successfully</w:t>
+      </w:r>
+      <w:r>
+        <w:rPr>
+          <w:b/>
+          <w:bCs/>
+        </w:rPr>
+        <w:br/>
+      </w:r>
+      <w:r>
+        <w:rPr>
+          <w:rFonts w:ascii="Segoe UI Emoji" w:hAnsi="Segoe UI Emoji" w:cs="Segoe UI Emoji"/>
+          <w:b/>
+          <w:bCs/>
+        </w:rPr>
+        <w:t>✅</w:t>
+      </w:r>
+      <w:r>
+        <w:rPr>
+          <w:b/>
+          <w:bCs/>
+        </w:rPr>
+        <w:t xml:space="preserve"> Validation completed</w:t>
+      </w:r>
+    </w:p>
+    <w:p>
+      <w:pPr>
+        <w:rPr>
+          <w:b/>
+          <w:bCs/>
+        </w:rPr>
+      </w:pPr>
+    </w:p>
+    <w:p>
+      <w:pPr>
+        <w:rPr>
+          <w:b/>
+          <w:bCs/>
+        </w:rPr>
+      </w:pPr>
+      <w:r>
+        <w:rPr>
+          <w:b/>
+          <w:bCs/>
+        </w:rPr>
+        <w:t>Project Status</w:t>
+      </w:r>
+    </w:p>
+    <w:p>
+      <w:pPr>
+        <w:rPr>
+          <w:b/>
+          <w:bCs/>
+        </w:rPr>
+      </w:pPr>
+      <w:r>
+        <w:rPr>
+          <w:b/>
+          <w:bCs/>
+        </w:rPr>
+        <w:t>Notebook 01</w:t>
+      </w:r>
+    </w:p>
+    <w:p>
+      <w:pPr>
+        <w:rPr>
+          <w:b/>
+          <w:bCs/>
+        </w:rPr>
+      </w:pPr>
+      <w:r>
+        <w:rPr>
+          <w:rFonts w:ascii="Segoe UI Emoji" w:hAnsi="Segoe UI Emoji" w:cs="Segoe UI Emoji"/>
+          <w:b/>
+          <w:bCs/>
+        </w:rPr>
+        <w:t>✅</w:t>
+      </w:r>
+      <w:r>
+        <w:rPr>
+          <w:b/>
+          <w:bCs/>
+        </w:rPr>
+        <w:t xml:space="preserve"> Data Exploration</w:t>
+      </w:r>
+    </w:p>
+    <w:p>
+      <w:pPr>
+        <w:rPr>
+          <w:b/>
+          <w:bCs/>
+        </w:rPr>
+      </w:pPr>
+      <w:r>
+        <w:rPr>
+          <w:b/>
+          <w:bCs/>
+        </w:rPr>
+        <w:t>Notebook 02</w:t>
+      </w:r>
+    </w:p>
+    <w:p>
+      <w:pPr>
+        <w:rPr>
+          <w:b/>
+          <w:bCs/>
+        </w:rPr>
+      </w:pPr>
+      <w:r>
+        <w:rPr>
+          <w:rFonts w:ascii="Segoe UI Emoji" w:hAnsi="Segoe UI Emoji" w:cs="Segoe UI Emoji"/>
+          <w:b/>
+          <w:bCs/>
+        </w:rPr>
+        <w:t>✅</w:t>
+      </w:r>
+      <w:r>
+        <w:rPr>
+          <w:b/>
+          <w:bCs/>
+        </w:rPr>
+        <w:t xml:space="preserve"> Retail EDA &amp; Business Insights</w:t>
+      </w:r>
+    </w:p>
+    <w:p>
+      <w:pPr>
+        <w:rPr>
+          <w:b/>
+          <w:bCs/>
+        </w:rPr>
+      </w:pPr>
+      <w:r>
+        <w:rPr>
+          <w:b/>
+          <w:bCs/>
+        </w:rPr>
+        <w:t>Notebook 03</w:t>
+      </w:r>
+    </w:p>
+    <w:p>
+      <w:pPr>
+        <w:rPr>
+          <w:b/>
+          <w:bCs/>
+        </w:rPr>
+      </w:pPr>
+      <w:r>
+        <w:rPr>
+          <w:rFonts w:ascii="Segoe UI Emoji" w:hAnsi="Segoe UI Emoji" w:cs="Segoe UI Emoji"/>
+          <w:b/>
+          <w:bCs/>
+        </w:rPr>
+        <w:t>✅</w:t>
+      </w:r>
+      <w:r>
+        <w:rPr>
+          <w:b/>
+          <w:bCs/>
+        </w:rPr>
+        <w:t xml:space="preserve"> Executive Dashboard Data Preparation</w:t>
+      </w:r>
+    </w:p>
+    <w:p>
+      <w:pPr>
+        <w:rPr>
+          <w:b/>
+          <w:bCs/>
+        </w:rPr>
+      </w:pPr>
+    </w:p>
+    <w:p>
+      <w:pPr>
+        <w:rPr>
+          <w:b/>
+          <w:bCs/>
+        </w:rPr>
+      </w:pPr>
+    </w:p>
+    <w:p>
+      <w:pPr>
+        <w:rPr>
+          <w:b/>
+          <w:bCs/>
+        </w:rPr>
+      </w:pPr>
+    </w:p>
+    <w:p>
+      <w:pPr>
+        <w:rPr>
+          <w:b/>
+          <w:bCs/>
+        </w:rPr>
+      </w:pPr>
+    </w:p>
+    <w:p>
+      <w:pPr>
+        <w:rPr>
+          <w:b/>
+          <w:bCs/>
+        </w:rPr>
+      </w:pPr>
+      <w:r>
+        <w:rPr>
+          <w:b/>
+          <w:bCs/>
+        </w:rPr>
         <w:t>Phase 1</w:t>
       </w:r>
     </w:p>
@@ -587,6 +949,44 @@
           <w:b/>
           <w:bCs/>
         </w:rPr>
+        <w:t>✅</w:t>
+      </w:r>
+      <w:r>
+        <w:rPr>
+          <w:b/>
+          <w:bCs/>
+        </w:rPr>
+        <w:t xml:space="preserve"> Executive Dashboard Data Preparation</w:t>
+      </w:r>
+    </w:p>
+    <w:p>
+      <w:pPr>
+        <w:rPr>
+          <w:b/>
+          <w:bCs/>
+        </w:rPr>
+      </w:pPr>
+      <w:r>
+        <w:rPr>
+          <w:b/>
+          <w:bCs/>
+        </w:rPr>
+        <w:t>Phase 3</w:t>
+      </w:r>
+    </w:p>
+    <w:p>
+      <w:pPr>
+        <w:rPr>
+          <w:b/>
+          <w:bCs/>
+        </w:rPr>
+      </w:pPr>
+      <w:r>
+        <w:rPr>
+          <w:rFonts w:ascii="Segoe UI Emoji" w:hAnsi="Segoe UI Emoji" w:cs="Segoe UI Emoji"/>
+          <w:b/>
+          <w:bCs/>
+        </w:rPr>
         <w:t>⬜</w:t>
       </w:r>
       <w:r>
@@ -594,22 +994,22 @@
           <w:b/>
           <w:bCs/>
         </w:rPr>
-        <w:t xml:space="preserve"> Executive Dashboard</w:t>
-      </w:r>
-    </w:p>
-    <w:p>
-      <w:pPr>
-        <w:rPr>
-          <w:b/>
-          <w:bCs/>
-        </w:rPr>
-      </w:pPr>
-      <w:r>
-        <w:rPr>
-          <w:b/>
-          <w:bCs/>
-        </w:rPr>
-        <w:t>Phase 3</w:t>
+        <w:t xml:space="preserve"> Customer Segmentation (RFM)</w:t>
+      </w:r>
+    </w:p>
+    <w:p>
+      <w:pPr>
+        <w:rPr>
+          <w:b/>
+          <w:bCs/>
+        </w:rPr>
+      </w:pPr>
+      <w:r>
+        <w:rPr>
+          <w:b/>
+          <w:bCs/>
+        </w:rPr>
+        <w:t>Phase 4</w:t>
       </w:r>
     </w:p>
     <w:p>
@@ -632,22 +1032,22 @@
           <w:b/>
           <w:bCs/>
         </w:rPr>
-        <w:t xml:space="preserve"> Customer Segmentation (RFM)</w:t>
-      </w:r>
-    </w:p>
-    <w:p>
-      <w:pPr>
-        <w:rPr>
-          <w:b/>
-          <w:bCs/>
-        </w:rPr>
-      </w:pPr>
-      <w:r>
-        <w:rPr>
-          <w:b/>
-          <w:bCs/>
-        </w:rPr>
-        <w:t>Phase 4</w:t>
+        <w:t xml:space="preserve"> Customer Churn Analytics</w:t>
+      </w:r>
+    </w:p>
+    <w:p>
+      <w:pPr>
+        <w:rPr>
+          <w:b/>
+          <w:bCs/>
+        </w:rPr>
+      </w:pPr>
+      <w:r>
+        <w:rPr>
+          <w:b/>
+          <w:bCs/>
+        </w:rPr>
+        <w:t>Phase 5</w:t>
       </w:r>
     </w:p>
     <w:p>
@@ -670,37 +1070,38 @@
           <w:b/>
           <w:bCs/>
         </w:rPr>
-        <w:t xml:space="preserve"> Customer Churn Analytics</w:t>
-      </w:r>
-    </w:p>
-    <w:p>
-      <w:pPr>
-        <w:rPr>
-          <w:b/>
-          <w:bCs/>
-        </w:rPr>
-      </w:pPr>
-      <w:r>
-        <w:rPr>
-          <w:b/>
-          <w:bCs/>
-        </w:rPr>
-        <w:t>Phase 5</w:t>
-      </w:r>
-    </w:p>
-    <w:p>
-      <w:pPr>
-        <w:rPr>
-          <w:b/>
-          <w:bCs/>
-        </w:rPr>
-      </w:pPr>
-      <w:r>
-        <w:rPr>
-          <w:rFonts w:ascii="Segoe UI Emoji" w:hAnsi="Segoe UI Emoji" w:cs="Segoe UI Emoji"/>
-          <w:b/>
-          <w:bCs/>
-        </w:rPr>
+        <w:t xml:space="preserve"> Demand Forecasting</w:t>
+      </w:r>
+    </w:p>
+    <w:p>
+      <w:pPr>
+        <w:rPr>
+          <w:b/>
+          <w:bCs/>
+        </w:rPr>
+      </w:pPr>
+      <w:r>
+        <w:rPr>
+          <w:b/>
+          <w:bCs/>
+        </w:rPr>
+        <w:t>Phase 6</w:t>
+      </w:r>
+    </w:p>
+    <w:p>
+      <w:pPr>
+        <w:rPr>
+          <w:b/>
+          <w:bCs/>
+        </w:rPr>
+      </w:pPr>
+      <w:r>
+        <w:rPr>
+          <w:rFonts w:ascii="Segoe UI Emoji" w:hAnsi="Segoe UI Emoji" w:cs="Segoe UI Emoji"/>
+          <w:b/>
+          <w:bCs/>
+        </w:rPr>
+        <w:lastRenderedPageBreak/>
         <w:t>⬜</w:t>
       </w:r>
       <w:r>
@@ -708,22 +1109,22 @@
           <w:b/>
           <w:bCs/>
         </w:rPr>
-        <w:t xml:space="preserve"> Demand Forecasting</w:t>
-      </w:r>
-    </w:p>
-    <w:p>
-      <w:pPr>
-        <w:rPr>
-          <w:b/>
-          <w:bCs/>
-        </w:rPr>
-      </w:pPr>
-      <w:r>
-        <w:rPr>
-          <w:b/>
-          <w:bCs/>
-        </w:rPr>
-        <w:t>Phase 6</w:t>
+        <w:t xml:space="preserve"> AI Retail Insights</w:t>
+      </w:r>
+    </w:p>
+    <w:p>
+      <w:pPr>
+        <w:rPr>
+          <w:b/>
+          <w:bCs/>
+        </w:rPr>
+      </w:pPr>
+      <w:r>
+        <w:rPr>
+          <w:b/>
+          <w:bCs/>
+        </w:rPr>
+        <w:t>Phase 7</w:t>
       </w:r>
     </w:p>
     <w:p>
@@ -746,44 +1147,6 @@
           <w:b/>
           <w:bCs/>
         </w:rPr>
-        <w:t xml:space="preserve"> AI Retail Insights</w:t>
-      </w:r>
-    </w:p>
-    <w:p>
-      <w:pPr>
-        <w:rPr>
-          <w:b/>
-          <w:bCs/>
-        </w:rPr>
-      </w:pPr>
-      <w:r>
-        <w:rPr>
-          <w:b/>
-          <w:bCs/>
-        </w:rPr>
-        <w:t>Phase 7</w:t>
-      </w:r>
-    </w:p>
-    <w:p>
-      <w:pPr>
-        <w:rPr>
-          <w:b/>
-          <w:bCs/>
-        </w:rPr>
-      </w:pPr>
-      <w:r>
-        <w:rPr>
-          <w:rFonts w:ascii="Segoe UI Emoji" w:hAnsi="Segoe UI Emoji" w:cs="Segoe UI Emoji"/>
-          <w:b/>
-          <w:bCs/>
-        </w:rPr>
-        <w:t>⬜</w:t>
-      </w:r>
-      <w:r>
-        <w:rPr>
-          <w:b/>
-          <w:bCs/>
-        </w:rPr>
         <w:t xml:space="preserve"> Retail Analytics Agent</w:t>
       </w:r>
     </w:p>
@@ -794,6 +1157,552 @@
           <w:bCs/>
         </w:rPr>
       </w:pPr>
+    </w:p>
+    <w:p>
+      <w:pPr>
+        <w:rPr>
+          <w:b/>
+          <w:bCs/>
+        </w:rPr>
+      </w:pPr>
+      <w:r>
+        <w:rPr>
+          <w:noProof/>
+        </w:rPr>
+        <w:drawing>
+          <wp:inline distT="0" distB="0" distL="0" distR="0" wp14:anchorId="6BFE02DB" wp14:editId="6D5ED850">
+            <wp:extent cx="5943600" cy="2990215"/>
+            <wp:effectExtent l="0" t="0" r="0" b="635"/>
+            <wp:docPr id="230851191" name="Picture 1"/>
+            <wp:cNvGraphicFramePr>
+              <a:graphicFrameLocks xmlns:a="http://schemas.openxmlformats.org/drawingml/2006/main" noChangeAspect="1"/>
+            </wp:cNvGraphicFramePr>
+            <a:graphic xmlns:a="http://schemas.openxmlformats.org/drawingml/2006/main">
+              <a:graphicData uri="http://schemas.openxmlformats.org/drawingml/2006/picture">
+                <pic:pic xmlns:pic="http://schemas.openxmlformats.org/drawingml/2006/picture">
+                  <pic:nvPicPr>
+                    <pic:cNvPr id="230851191" name=""/>
+                    <pic:cNvPicPr/>
+                  </pic:nvPicPr>
+                  <pic:blipFill>
+                    <a:blip r:embed="rId4"/>
+                    <a:stretch>
+                      <a:fillRect/>
+                    </a:stretch>
+                  </pic:blipFill>
+                  <pic:spPr>
+                    <a:xfrm>
+                      <a:off x="0" y="0"/>
+                      <a:ext cx="5943600" cy="2990215"/>
+                    </a:xfrm>
+                    <a:prstGeom prst="rect">
+                      <a:avLst/>
+                    </a:prstGeom>
+                  </pic:spPr>
+                </pic:pic>
+              </a:graphicData>
+            </a:graphic>
+          </wp:inline>
+        </w:drawing>
+      </w:r>
+    </w:p>
+    <w:p>
+      <w:pPr>
+        <w:rPr>
+          <w:b/>
+          <w:bCs/>
+        </w:rPr>
+      </w:pPr>
+      <w:r>
+        <w:rPr>
+          <w:noProof/>
+        </w:rPr>
+        <w:drawing>
+          <wp:inline distT="0" distB="0" distL="0" distR="0" wp14:anchorId="2E72A0F6" wp14:editId="7DBB39A9">
+            <wp:extent cx="5943600" cy="3679825"/>
+            <wp:effectExtent l="0" t="0" r="0" b="0"/>
+            <wp:docPr id="597210305" name="Picture 1"/>
+            <wp:cNvGraphicFramePr>
+              <a:graphicFrameLocks xmlns:a="http://schemas.openxmlformats.org/drawingml/2006/main" noChangeAspect="1"/>
+            </wp:cNvGraphicFramePr>
+            <a:graphic xmlns:a="http://schemas.openxmlformats.org/drawingml/2006/main">
+              <a:graphicData uri="http://schemas.openxmlformats.org/drawingml/2006/picture">
+                <pic:pic xmlns:pic="http://schemas.openxmlformats.org/drawingml/2006/picture">
+                  <pic:nvPicPr>
+                    <pic:cNvPr id="597210305" name=""/>
+                    <pic:cNvPicPr/>
+                  </pic:nvPicPr>
+                  <pic:blipFill>
+                    <a:blip r:embed="rId5"/>
+                    <a:stretch>
+                      <a:fillRect/>
+                    </a:stretch>
+                  </pic:blipFill>
+                  <pic:spPr>
+                    <a:xfrm>
+                      <a:off x="0" y="0"/>
+                      <a:ext cx="5943600" cy="3679825"/>
+                    </a:xfrm>
+                    <a:prstGeom prst="rect">
+                      <a:avLst/>
+                    </a:prstGeom>
+                  </pic:spPr>
+                </pic:pic>
+              </a:graphicData>
+            </a:graphic>
+          </wp:inline>
+        </w:drawing>
+      </w:r>
+    </w:p>
+    <w:p>
+      <w:pPr>
+        <w:rPr>
+          <w:b/>
+          <w:bCs/>
+        </w:rPr>
+      </w:pPr>
+    </w:p>
+    <w:p>
+      <w:pPr>
+        <w:rPr>
+          <w:b/>
+          <w:bCs/>
+        </w:rPr>
+      </w:pPr>
+      <w:r>
+        <w:rPr>
+          <w:noProof/>
+        </w:rPr>
+        <w:drawing>
+          <wp:inline distT="0" distB="0" distL="0" distR="0" wp14:anchorId="6B8C819A" wp14:editId="4F2CCEBE">
+            <wp:extent cx="5943600" cy="2188845"/>
+            <wp:effectExtent l="0" t="0" r="0" b="1905"/>
+            <wp:docPr id="1096528937" name="Picture 1"/>
+            <wp:cNvGraphicFramePr>
+              <a:graphicFrameLocks xmlns:a="http://schemas.openxmlformats.org/drawingml/2006/main" noChangeAspect="1"/>
+            </wp:cNvGraphicFramePr>
+            <a:graphic xmlns:a="http://schemas.openxmlformats.org/drawingml/2006/main">
+              <a:graphicData uri="http://schemas.openxmlformats.org/drawingml/2006/picture">
+                <pic:pic xmlns:pic="http://schemas.openxmlformats.org/drawingml/2006/picture">
+                  <pic:nvPicPr>
+                    <pic:cNvPr id="1096528937" name=""/>
+                    <pic:cNvPicPr/>
+                  </pic:nvPicPr>
+                  <pic:blipFill>
+                    <a:blip r:embed="rId6"/>
+                    <a:stretch>
+                      <a:fillRect/>
+                    </a:stretch>
+                  </pic:blipFill>
+                  <pic:spPr>
+                    <a:xfrm>
+                      <a:off x="0" y="0"/>
+                      <a:ext cx="5943600" cy="2188845"/>
+                    </a:xfrm>
+                    <a:prstGeom prst="rect">
+                      <a:avLst/>
+                    </a:prstGeom>
+                  </pic:spPr>
+                </pic:pic>
+              </a:graphicData>
+            </a:graphic>
+          </wp:inline>
+        </w:drawing>
+      </w:r>
+    </w:p>
+    <w:p>
+      <w:pPr>
+        <w:rPr>
+          <w:b/>
+          <w:bCs/>
+        </w:rPr>
+      </w:pPr>
+    </w:p>
+    <w:p>
+      <w:pPr>
+        <w:rPr>
+          <w:b/>
+          <w:bCs/>
+        </w:rPr>
+      </w:pPr>
+      <w:r>
+        <w:rPr>
+          <w:noProof/>
+        </w:rPr>
+        <w:drawing>
+          <wp:inline distT="0" distB="0" distL="0" distR="0" wp14:anchorId="38A29910" wp14:editId="180B98D9">
+            <wp:extent cx="5943600" cy="2049145"/>
+            <wp:effectExtent l="0" t="0" r="0" b="8255"/>
+            <wp:docPr id="872324239" name="Picture 1"/>
+            <wp:cNvGraphicFramePr>
+              <a:graphicFrameLocks xmlns:a="http://schemas.openxmlformats.org/drawingml/2006/main" noChangeAspect="1"/>
+            </wp:cNvGraphicFramePr>
+            <a:graphic xmlns:a="http://schemas.openxmlformats.org/drawingml/2006/main">
+              <a:graphicData uri="http://schemas.openxmlformats.org/drawingml/2006/picture">
+                <pic:pic xmlns:pic="http://schemas.openxmlformats.org/drawingml/2006/picture">
+                  <pic:nvPicPr>
+                    <pic:cNvPr id="872324239" name=""/>
+                    <pic:cNvPicPr/>
+                  </pic:nvPicPr>
+                  <pic:blipFill>
+                    <a:blip r:embed="rId7"/>
+                    <a:stretch>
+                      <a:fillRect/>
+                    </a:stretch>
+                  </pic:blipFill>
+                  <pic:spPr>
+                    <a:xfrm>
+                      <a:off x="0" y="0"/>
+                      <a:ext cx="5943600" cy="2049145"/>
+                    </a:xfrm>
+                    <a:prstGeom prst="rect">
+                      <a:avLst/>
+                    </a:prstGeom>
+                  </pic:spPr>
+                </pic:pic>
+              </a:graphicData>
+            </a:graphic>
+          </wp:inline>
+        </w:drawing>
+      </w:r>
+    </w:p>
+    <w:p>
+      <w:pPr>
+        <w:rPr>
+          <w:b/>
+          <w:bCs/>
+        </w:rPr>
+      </w:pPr>
+      <w:r>
+        <w:rPr>
+          <w:noProof/>
+        </w:rPr>
+        <w:drawing>
+          <wp:inline distT="0" distB="0" distL="0" distR="0" wp14:anchorId="206B5EA5" wp14:editId="6039A4A9">
+            <wp:extent cx="5943600" cy="2210435"/>
+            <wp:effectExtent l="0" t="0" r="0" b="0"/>
+            <wp:docPr id="713358110" name="Picture 1"/>
+            <wp:cNvGraphicFramePr>
+              <a:graphicFrameLocks xmlns:a="http://schemas.openxmlformats.org/drawingml/2006/main" noChangeAspect="1"/>
+            </wp:cNvGraphicFramePr>
+            <a:graphic xmlns:a="http://schemas.openxmlformats.org/drawingml/2006/main">
+              <a:graphicData uri="http://schemas.openxmlformats.org/drawingml/2006/picture">
+                <pic:pic xmlns:pic="http://schemas.openxmlformats.org/drawingml/2006/picture">
+                  <pic:nvPicPr>
+                    <pic:cNvPr id="713358110" name=""/>
+                    <pic:cNvPicPr/>
+                  </pic:nvPicPr>
+                  <pic:blipFill>
+                    <a:blip r:embed="rId8"/>
+                    <a:stretch>
+                      <a:fillRect/>
+                    </a:stretch>
+                  </pic:blipFill>
+                  <pic:spPr>
+                    <a:xfrm>
+                      <a:off x="0" y="0"/>
+                      <a:ext cx="5943600" cy="2210435"/>
+                    </a:xfrm>
+                    <a:prstGeom prst="rect">
+                      <a:avLst/>
+                    </a:prstGeom>
+                  </pic:spPr>
+                </pic:pic>
+              </a:graphicData>
+            </a:graphic>
+          </wp:inline>
+        </w:drawing>
+      </w:r>
+    </w:p>
+    <w:p>
+      <w:pPr>
+        <w:rPr>
+          <w:b/>
+          <w:bCs/>
+        </w:rPr>
+      </w:pPr>
+      <w:r>
+        <w:rPr>
+          <w:noProof/>
+        </w:rPr>
+        <w:lastRenderedPageBreak/>
+        <w:drawing>
+          <wp:inline distT="0" distB="0" distL="0" distR="0" wp14:anchorId="429CC9E2" wp14:editId="5CB532E5">
+            <wp:extent cx="5943600" cy="2174240"/>
+            <wp:effectExtent l="0" t="0" r="0" b="0"/>
+            <wp:docPr id="1975638834" name="Picture 1"/>
+            <wp:cNvGraphicFramePr>
+              <a:graphicFrameLocks xmlns:a="http://schemas.openxmlformats.org/drawingml/2006/main" noChangeAspect="1"/>
+            </wp:cNvGraphicFramePr>
+            <a:graphic xmlns:a="http://schemas.openxmlformats.org/drawingml/2006/main">
+              <a:graphicData uri="http://schemas.openxmlformats.org/drawingml/2006/picture">
+                <pic:pic xmlns:pic="http://schemas.openxmlformats.org/drawingml/2006/picture">
+                  <pic:nvPicPr>
+                    <pic:cNvPr id="1975638834" name=""/>
+                    <pic:cNvPicPr/>
+                  </pic:nvPicPr>
+                  <pic:blipFill>
+                    <a:blip r:embed="rId9"/>
+                    <a:stretch>
+                      <a:fillRect/>
+                    </a:stretch>
+                  </pic:blipFill>
+                  <pic:spPr>
+                    <a:xfrm>
+                      <a:off x="0" y="0"/>
+                      <a:ext cx="5943600" cy="2174240"/>
+                    </a:xfrm>
+                    <a:prstGeom prst="rect">
+                      <a:avLst/>
+                    </a:prstGeom>
+                  </pic:spPr>
+                </pic:pic>
+              </a:graphicData>
+            </a:graphic>
+          </wp:inline>
+        </w:drawing>
+      </w:r>
+    </w:p>
+    <w:p>
+      <w:pPr>
+        <w:rPr>
+          <w:b/>
+          <w:bCs/>
+        </w:rPr>
+      </w:pPr>
+      <w:r>
+        <w:rPr>
+          <w:noProof/>
+        </w:rPr>
+        <w:drawing>
+          <wp:inline distT="0" distB="0" distL="0" distR="0" wp14:anchorId="0B953274" wp14:editId="03F018C0">
+            <wp:extent cx="5943600" cy="2005965"/>
+            <wp:effectExtent l="0" t="0" r="0" b="0"/>
+            <wp:docPr id="474442660" name="Picture 1"/>
+            <wp:cNvGraphicFramePr>
+              <a:graphicFrameLocks xmlns:a="http://schemas.openxmlformats.org/drawingml/2006/main" noChangeAspect="1"/>
+            </wp:cNvGraphicFramePr>
+            <a:graphic xmlns:a="http://schemas.openxmlformats.org/drawingml/2006/main">
+              <a:graphicData uri="http://schemas.openxmlformats.org/drawingml/2006/picture">
+                <pic:pic xmlns:pic="http://schemas.openxmlformats.org/drawingml/2006/picture">
+                  <pic:nvPicPr>
+                    <pic:cNvPr id="474442660" name=""/>
+                    <pic:cNvPicPr/>
+                  </pic:nvPicPr>
+                  <pic:blipFill>
+                    <a:blip r:embed="rId10"/>
+                    <a:stretch>
+                      <a:fillRect/>
+                    </a:stretch>
+                  </pic:blipFill>
+                  <pic:spPr>
+                    <a:xfrm>
+                      <a:off x="0" y="0"/>
+                      <a:ext cx="5943600" cy="2005965"/>
+                    </a:xfrm>
+                    <a:prstGeom prst="rect">
+                      <a:avLst/>
+                    </a:prstGeom>
+                  </pic:spPr>
+                </pic:pic>
+              </a:graphicData>
+            </a:graphic>
+          </wp:inline>
+        </w:drawing>
+      </w:r>
+    </w:p>
+    <w:p>
+      <w:pPr>
+        <w:rPr>
+          <w:b/>
+          <w:bCs/>
+        </w:rPr>
+      </w:pPr>
+      <w:r>
+        <w:rPr>
+          <w:noProof/>
+        </w:rPr>
+        <w:drawing>
+          <wp:inline distT="0" distB="0" distL="0" distR="0" wp14:anchorId="0C3778C8" wp14:editId="777ED101">
+            <wp:extent cx="5943600" cy="2007870"/>
+            <wp:effectExtent l="0" t="0" r="0" b="0"/>
+            <wp:docPr id="53421732" name="Picture 1"/>
+            <wp:cNvGraphicFramePr>
+              <a:graphicFrameLocks xmlns:a="http://schemas.openxmlformats.org/drawingml/2006/main" noChangeAspect="1"/>
+            </wp:cNvGraphicFramePr>
+            <a:graphic xmlns:a="http://schemas.openxmlformats.org/drawingml/2006/main">
+              <a:graphicData uri="http://schemas.openxmlformats.org/drawingml/2006/picture">
+                <pic:pic xmlns:pic="http://schemas.openxmlformats.org/drawingml/2006/picture">
+                  <pic:nvPicPr>
+                    <pic:cNvPr id="53421732" name=""/>
+                    <pic:cNvPicPr/>
+                  </pic:nvPicPr>
+                  <pic:blipFill>
+                    <a:blip r:embed="rId11"/>
+                    <a:stretch>
+                      <a:fillRect/>
+                    </a:stretch>
+                  </pic:blipFill>
+                  <pic:spPr>
+                    <a:xfrm>
+                      <a:off x="0" y="0"/>
+                      <a:ext cx="5943600" cy="2007870"/>
+                    </a:xfrm>
+                    <a:prstGeom prst="rect">
+                      <a:avLst/>
+                    </a:prstGeom>
+                  </pic:spPr>
+                </pic:pic>
+              </a:graphicData>
+            </a:graphic>
+          </wp:inline>
+        </w:drawing>
+      </w:r>
+    </w:p>
+    <w:p>
+      <w:pPr>
+        <w:rPr>
+          <w:b/>
+          <w:bCs/>
+        </w:rPr>
+      </w:pPr>
+      <w:r>
+        <w:rPr>
+          <w:noProof/>
+        </w:rPr>
+        <w:lastRenderedPageBreak/>
+        <w:drawing>
+          <wp:inline distT="0" distB="0" distL="0" distR="0" wp14:anchorId="50D8425F" wp14:editId="126C1071">
+            <wp:extent cx="5943600" cy="2081530"/>
+            <wp:effectExtent l="0" t="0" r="0" b="0"/>
+            <wp:docPr id="454289060" name="Picture 1"/>
+            <wp:cNvGraphicFramePr>
+              <a:graphicFrameLocks xmlns:a="http://schemas.openxmlformats.org/drawingml/2006/main" noChangeAspect="1"/>
+            </wp:cNvGraphicFramePr>
+            <a:graphic xmlns:a="http://schemas.openxmlformats.org/drawingml/2006/main">
+              <a:graphicData uri="http://schemas.openxmlformats.org/drawingml/2006/picture">
+                <pic:pic xmlns:pic="http://schemas.openxmlformats.org/drawingml/2006/picture">
+                  <pic:nvPicPr>
+                    <pic:cNvPr id="454289060" name=""/>
+                    <pic:cNvPicPr/>
+                  </pic:nvPicPr>
+                  <pic:blipFill>
+                    <a:blip r:embed="rId12"/>
+                    <a:stretch>
+                      <a:fillRect/>
+                    </a:stretch>
+                  </pic:blipFill>
+                  <pic:spPr>
+                    <a:xfrm>
+                      <a:off x="0" y="0"/>
+                      <a:ext cx="5943600" cy="2081530"/>
+                    </a:xfrm>
+                    <a:prstGeom prst="rect">
+                      <a:avLst/>
+                    </a:prstGeom>
+                  </pic:spPr>
+                </pic:pic>
+              </a:graphicData>
+            </a:graphic>
+          </wp:inline>
+        </w:drawing>
+      </w:r>
+    </w:p>
+    <w:p>
+      <w:pPr>
+        <w:rPr>
+          <w:b/>
+          <w:bCs/>
+        </w:rPr>
+      </w:pPr>
+      <w:r>
+        <w:rPr>
+          <w:noProof/>
+        </w:rPr>
+        <w:drawing>
+          <wp:inline distT="0" distB="0" distL="0" distR="0" wp14:anchorId="6FFC1171" wp14:editId="71699CF4">
+            <wp:extent cx="5943600" cy="1535430"/>
+            <wp:effectExtent l="0" t="0" r="0" b="7620"/>
+            <wp:docPr id="913074699" name="Picture 1"/>
+            <wp:cNvGraphicFramePr>
+              <a:graphicFrameLocks xmlns:a="http://schemas.openxmlformats.org/drawingml/2006/main" noChangeAspect="1"/>
+            </wp:cNvGraphicFramePr>
+            <a:graphic xmlns:a="http://schemas.openxmlformats.org/drawingml/2006/main">
+              <a:graphicData uri="http://schemas.openxmlformats.org/drawingml/2006/picture">
+                <pic:pic xmlns:pic="http://schemas.openxmlformats.org/drawingml/2006/picture">
+                  <pic:nvPicPr>
+                    <pic:cNvPr id="913074699" name=""/>
+                    <pic:cNvPicPr/>
+                  </pic:nvPicPr>
+                  <pic:blipFill>
+                    <a:blip r:embed="rId13"/>
+                    <a:stretch>
+                      <a:fillRect/>
+                    </a:stretch>
+                  </pic:blipFill>
+                  <pic:spPr>
+                    <a:xfrm>
+                      <a:off x="0" y="0"/>
+                      <a:ext cx="5943600" cy="1535430"/>
+                    </a:xfrm>
+                    <a:prstGeom prst="rect">
+                      <a:avLst/>
+                    </a:prstGeom>
+                  </pic:spPr>
+                </pic:pic>
+              </a:graphicData>
+            </a:graphic>
+          </wp:inline>
+        </w:drawing>
+      </w:r>
+    </w:p>
+    <w:p>
+      <w:pPr>
+        <w:rPr>
+          <w:b/>
+          <w:bCs/>
+        </w:rPr>
+      </w:pPr>
+      <w:r>
+        <w:rPr>
+          <w:noProof/>
+        </w:rPr>
+        <w:drawing>
+          <wp:inline distT="0" distB="0" distL="0" distR="0" wp14:anchorId="02CD5702" wp14:editId="48DB13C1">
+            <wp:extent cx="5943600" cy="1965960"/>
+            <wp:effectExtent l="0" t="0" r="0" b="0"/>
+            <wp:docPr id="1613140144" name="Picture 1"/>
+            <wp:cNvGraphicFramePr>
+              <a:graphicFrameLocks xmlns:a="http://schemas.openxmlformats.org/drawingml/2006/main" noChangeAspect="1"/>
+            </wp:cNvGraphicFramePr>
+            <a:graphic xmlns:a="http://schemas.openxmlformats.org/drawingml/2006/main">
+              <a:graphicData uri="http://schemas.openxmlformats.org/drawingml/2006/picture">
+                <pic:pic xmlns:pic="http://schemas.openxmlformats.org/drawingml/2006/picture">
+                  <pic:nvPicPr>
+                    <pic:cNvPr id="1613140144" name=""/>
+                    <pic:cNvPicPr/>
+                  </pic:nvPicPr>
+                  <pic:blipFill>
+                    <a:blip r:embed="rId14"/>
+                    <a:stretch>
+                      <a:fillRect/>
+                    </a:stretch>
+                  </pic:blipFill>
+                  <pic:spPr>
+                    <a:xfrm>
+                      <a:off x="0" y="0"/>
+                      <a:ext cx="5943600" cy="1965960"/>
+                    </a:xfrm>
+                    <a:prstGeom prst="rect">
+                      <a:avLst/>
+                    </a:prstGeom>
+                  </pic:spPr>
+                </pic:pic>
+              </a:graphicData>
+            </a:graphic>
+          </wp:inline>
+        </w:drawing>
+      </w:r>
     </w:p>
     <w:sectPr>
       <w:pgSz w:w="12240" w:h="15840"/>
@@ -1205,6 +2114,7 @@
   <w:style w:type="paragraph" w:default="1" w:styleId="Normal">
     <w:name w:val="Normal"/>
     <w:qFormat/>
+    <w:rsid w:val="00FD0C16"/>
   </w:style>
   <w:style w:type="paragraph" w:styleId="Heading1">
     <w:name w:val="heading 1"/>

</xml_diff>

<commit_message>
Completed customer segmentation using RFM analysis
</commit_message>
<xml_diff>
--- a/screenshots/03_Executive_Dashboard_Data_Prep.ipynb_Screenshots.docx
+++ b/screenshots/03_Executive_Dashboard_Data_Prep.ipynb_Screenshots.docx
@@ -866,30 +866,6 @@
           <w:bCs/>
         </w:rPr>
       </w:pPr>
-    </w:p>
-    <w:p>
-      <w:pPr>
-        <w:rPr>
-          <w:b/>
-          <w:bCs/>
-        </w:rPr>
-      </w:pPr>
-    </w:p>
-    <w:p>
-      <w:pPr>
-        <w:rPr>
-          <w:b/>
-          <w:bCs/>
-        </w:rPr>
-      </w:pPr>
-    </w:p>
-    <w:p>
-      <w:pPr>
-        <w:rPr>
-          <w:b/>
-          <w:bCs/>
-        </w:rPr>
-      </w:pPr>
       <w:r>
         <w:rPr>
           <w:b/>
@@ -1101,8 +1077,352 @@
           <w:b/>
           <w:bCs/>
         </w:rPr>
+        <w:t>⬜</w:t>
+      </w:r>
+      <w:r>
+        <w:rPr>
+          <w:b/>
+          <w:bCs/>
+        </w:rPr>
+        <w:t xml:space="preserve"> AI Retail Insights</w:t>
+      </w:r>
+    </w:p>
+    <w:p>
+      <w:pPr>
+        <w:rPr>
+          <w:b/>
+          <w:bCs/>
+        </w:rPr>
+      </w:pPr>
+      <w:r>
+        <w:rPr>
+          <w:b/>
+          <w:bCs/>
+        </w:rPr>
+        <w:t>Phase 7</w:t>
+      </w:r>
+    </w:p>
+    <w:p>
+      <w:pPr>
+        <w:rPr>
+          <w:b/>
+          <w:bCs/>
+        </w:rPr>
+      </w:pPr>
+      <w:r>
+        <w:rPr>
+          <w:rFonts w:ascii="Segoe UI Emoji" w:hAnsi="Segoe UI Emoji" w:cs="Segoe UI Emoji"/>
+          <w:b/>
+          <w:bCs/>
+        </w:rPr>
+        <w:t>⬜</w:t>
+      </w:r>
+      <w:r>
+        <w:rPr>
+          <w:b/>
+          <w:bCs/>
+        </w:rPr>
+        <w:t xml:space="preserve"> Retail Analytics Agent</w:t>
+      </w:r>
+    </w:p>
+    <w:p>
+      <w:pPr>
+        <w:rPr>
+          <w:b/>
+          <w:bCs/>
+        </w:rPr>
+      </w:pPr>
+      <w:r>
+        <w:rPr>
+          <w:b/>
+          <w:bCs/>
+        </w:rPr>
         <w:lastRenderedPageBreak/>
-        <w:t>⬜</w:t>
+        <w:t>Retail Analytics Platform</w:t>
+      </w:r>
+    </w:p>
+    <w:p>
+      <w:pPr>
+        <w:rPr>
+          <w:b/>
+          <w:bCs/>
+        </w:rPr>
+      </w:pPr>
+      <w:r>
+        <w:rPr>
+          <w:b/>
+          <w:bCs/>
+        </w:rPr>
+        <w:t>│</w:t>
+      </w:r>
+    </w:p>
+    <w:p>
+      <w:pPr>
+        <w:rPr>
+          <w:b/>
+          <w:bCs/>
+        </w:rPr>
+      </w:pPr>
+      <w:r>
+        <w:rPr>
+          <w:rFonts w:ascii="MS Gothic" w:eastAsia="MS Gothic" w:hAnsi="MS Gothic" w:cs="MS Gothic" w:hint="eastAsia"/>
+          <w:b/>
+          <w:bCs/>
+        </w:rPr>
+        <w:t>├</w:t>
+      </w:r>
+      <w:r>
+        <w:rPr>
+          <w:rFonts w:ascii="Aptos" w:hAnsi="Aptos" w:cs="Aptos"/>
+          <w:b/>
+          <w:bCs/>
+        </w:rPr>
+        <w:t>──</w:t>
+      </w:r>
+      <w:r>
+        <w:rPr>
+          <w:b/>
+          <w:bCs/>
+        </w:rPr>
+        <w:t xml:space="preserve"> Phase 1 </w:t>
+      </w:r>
+      <w:r>
+        <w:rPr>
+          <w:rFonts w:ascii="Segoe UI Emoji" w:hAnsi="Segoe UI Emoji" w:cs="Segoe UI Emoji"/>
+          <w:b/>
+          <w:bCs/>
+        </w:rPr>
+        <w:t>✅</w:t>
+      </w:r>
+      <w:r>
+        <w:rPr>
+          <w:b/>
+          <w:bCs/>
+        </w:rPr>
+        <w:t xml:space="preserve"> EDA</w:t>
+      </w:r>
+    </w:p>
+    <w:p>
+      <w:pPr>
+        <w:rPr>
+          <w:b/>
+          <w:bCs/>
+        </w:rPr>
+      </w:pPr>
+      <w:r>
+        <w:rPr>
+          <w:rFonts w:ascii="MS Gothic" w:eastAsia="MS Gothic" w:hAnsi="MS Gothic" w:cs="MS Gothic" w:hint="eastAsia"/>
+          <w:b/>
+          <w:bCs/>
+        </w:rPr>
+        <w:t>├</w:t>
+      </w:r>
+      <w:r>
+        <w:rPr>
+          <w:rFonts w:ascii="Aptos" w:hAnsi="Aptos" w:cs="Aptos"/>
+          <w:b/>
+          <w:bCs/>
+        </w:rPr>
+        <w:t>──</w:t>
+      </w:r>
+      <w:r>
+        <w:rPr>
+          <w:b/>
+          <w:bCs/>
+        </w:rPr>
+        <w:t xml:space="preserve"> Phase 2 </w:t>
+      </w:r>
+      <w:r>
+        <w:rPr>
+          <w:rFonts w:ascii="Segoe UI Emoji" w:hAnsi="Segoe UI Emoji" w:cs="Segoe UI Emoji"/>
+          <w:b/>
+          <w:bCs/>
+        </w:rPr>
+        <w:t>✅</w:t>
+      </w:r>
+      <w:r>
+        <w:rPr>
+          <w:b/>
+          <w:bCs/>
+        </w:rPr>
+        <w:t xml:space="preserve"> Executive Dashboard Data Prep</w:t>
+      </w:r>
+    </w:p>
+    <w:p>
+      <w:pPr>
+        <w:rPr>
+          <w:b/>
+          <w:bCs/>
+        </w:rPr>
+      </w:pPr>
+      <w:r>
+        <w:rPr>
+          <w:rFonts w:ascii="MS Gothic" w:eastAsia="MS Gothic" w:hAnsi="MS Gothic" w:cs="MS Gothic" w:hint="eastAsia"/>
+          <w:b/>
+          <w:bCs/>
+        </w:rPr>
+        <w:t>├</w:t>
+      </w:r>
+      <w:r>
+        <w:rPr>
+          <w:rFonts w:ascii="Aptos" w:hAnsi="Aptos" w:cs="Aptos"/>
+          <w:b/>
+          <w:bCs/>
+        </w:rPr>
+        <w:t>──</w:t>
+      </w:r>
+      <w:r>
+        <w:rPr>
+          <w:b/>
+          <w:bCs/>
+        </w:rPr>
+        <w:t xml:space="preserve"> Phase 3 </w:t>
+      </w:r>
+      <w:r>
+        <w:rPr>
+          <w:rFonts w:ascii="Segoe UI Emoji" w:hAnsi="Segoe UI Emoji" w:cs="Segoe UI Emoji"/>
+          <w:b/>
+          <w:bCs/>
+        </w:rPr>
+        <w:t>⏳</w:t>
+      </w:r>
+      <w:r>
+        <w:rPr>
+          <w:b/>
+          <w:bCs/>
+        </w:rPr>
+        <w:t xml:space="preserve"> Customer Segmentation (RFM)</w:t>
+      </w:r>
+    </w:p>
+    <w:p>
+      <w:pPr>
+        <w:rPr>
+          <w:b/>
+          <w:bCs/>
+        </w:rPr>
+      </w:pPr>
+      <w:r>
+        <w:rPr>
+          <w:rFonts w:ascii="MS Gothic" w:eastAsia="MS Gothic" w:hAnsi="MS Gothic" w:cs="MS Gothic" w:hint="eastAsia"/>
+          <w:b/>
+          <w:bCs/>
+        </w:rPr>
+        <w:t>├</w:t>
+      </w:r>
+      <w:r>
+        <w:rPr>
+          <w:rFonts w:ascii="Aptos" w:hAnsi="Aptos" w:cs="Aptos"/>
+          <w:b/>
+          <w:bCs/>
+        </w:rPr>
+        <w:t>──</w:t>
+      </w:r>
+      <w:r>
+        <w:rPr>
+          <w:b/>
+          <w:bCs/>
+        </w:rPr>
+        <w:t xml:space="preserve"> Phase 4 </w:t>
+      </w:r>
+      <w:r>
+        <w:rPr>
+          <w:rFonts w:ascii="Segoe UI Emoji" w:hAnsi="Segoe UI Emoji" w:cs="Segoe UI Emoji"/>
+          <w:b/>
+          <w:bCs/>
+        </w:rPr>
+        <w:t>⏳</w:t>
+      </w:r>
+      <w:r>
+        <w:rPr>
+          <w:b/>
+          <w:bCs/>
+        </w:rPr>
+        <w:t xml:space="preserve"> Customer Churn Analytics</w:t>
+      </w:r>
+    </w:p>
+    <w:p>
+      <w:pPr>
+        <w:rPr>
+          <w:b/>
+          <w:bCs/>
+        </w:rPr>
+      </w:pPr>
+      <w:r>
+        <w:rPr>
+          <w:rFonts w:ascii="MS Gothic" w:eastAsia="MS Gothic" w:hAnsi="MS Gothic" w:cs="MS Gothic" w:hint="eastAsia"/>
+          <w:b/>
+          <w:bCs/>
+        </w:rPr>
+        <w:t>├</w:t>
+      </w:r>
+      <w:r>
+        <w:rPr>
+          <w:rFonts w:ascii="Aptos" w:hAnsi="Aptos" w:cs="Aptos"/>
+          <w:b/>
+          <w:bCs/>
+        </w:rPr>
+        <w:t>──</w:t>
+      </w:r>
+      <w:r>
+        <w:rPr>
+          <w:b/>
+          <w:bCs/>
+        </w:rPr>
+        <w:t xml:space="preserve"> Phase 5 </w:t>
+      </w:r>
+      <w:r>
+        <w:rPr>
+          <w:rFonts w:ascii="Segoe UI Emoji" w:hAnsi="Segoe UI Emoji" w:cs="Segoe UI Emoji"/>
+          <w:b/>
+          <w:bCs/>
+        </w:rPr>
+        <w:t>⏳</w:t>
+      </w:r>
+      <w:r>
+        <w:rPr>
+          <w:b/>
+          <w:bCs/>
+        </w:rPr>
+        <w:t xml:space="preserve"> Demand Forecasting</w:t>
+      </w:r>
+    </w:p>
+    <w:p>
+      <w:pPr>
+        <w:rPr>
+          <w:b/>
+          <w:bCs/>
+        </w:rPr>
+      </w:pPr>
+      <w:r>
+        <w:rPr>
+          <w:rFonts w:ascii="MS Gothic" w:eastAsia="MS Gothic" w:hAnsi="MS Gothic" w:cs="MS Gothic" w:hint="eastAsia"/>
+          <w:b/>
+          <w:bCs/>
+        </w:rPr>
+        <w:t>├</w:t>
+      </w:r>
+      <w:r>
+        <w:rPr>
+          <w:rFonts w:ascii="Aptos" w:hAnsi="Aptos" w:cs="Aptos"/>
+          <w:b/>
+          <w:bCs/>
+        </w:rPr>
+        <w:t>──</w:t>
+      </w:r>
+      <w:r>
+        <w:rPr>
+          <w:b/>
+          <w:bCs/>
+        </w:rPr>
+        <w:t xml:space="preserve"> Phase 6 </w:t>
+      </w:r>
+      <w:r>
+        <w:rPr>
+          <w:rFonts w:ascii="Segoe UI Emoji" w:hAnsi="Segoe UI Emoji" w:cs="Segoe UI Emoji"/>
+          <w:b/>
+          <w:bCs/>
+        </w:rPr>
+        <w:t>⏳</w:t>
       </w:r>
       <w:r>
         <w:rPr>
@@ -1121,26 +1441,34 @@
       </w:pPr>
       <w:r>
         <w:rPr>
-          <w:b/>
-          <w:bCs/>
-        </w:rPr>
-        <w:t>Phase 7</w:t>
-      </w:r>
-    </w:p>
-    <w:p>
-      <w:pPr>
-        <w:rPr>
-          <w:b/>
-          <w:bCs/>
-        </w:rPr>
-      </w:pPr>
-      <w:r>
-        <w:rPr>
-          <w:rFonts w:ascii="Segoe UI Emoji" w:hAnsi="Segoe UI Emoji" w:cs="Segoe UI Emoji"/>
-          <w:b/>
-          <w:bCs/>
-        </w:rPr>
-        <w:t>⬜</w:t>
+          <w:rFonts w:ascii="MS Gothic" w:eastAsia="MS Gothic" w:hAnsi="MS Gothic" w:cs="MS Gothic" w:hint="eastAsia"/>
+          <w:b/>
+          <w:bCs/>
+        </w:rPr>
+        <w:t>├</w:t>
+      </w:r>
+      <w:r>
+        <w:rPr>
+          <w:rFonts w:ascii="Aptos" w:hAnsi="Aptos" w:cs="Aptos"/>
+          <w:b/>
+          <w:bCs/>
+        </w:rPr>
+        <w:t>──</w:t>
+      </w:r>
+      <w:r>
+        <w:rPr>
+          <w:b/>
+          <w:bCs/>
+        </w:rPr>
+        <w:t xml:space="preserve"> Phase 7 </w:t>
+      </w:r>
+      <w:r>
+        <w:rPr>
+          <w:rFonts w:ascii="Segoe UI Emoji" w:hAnsi="Segoe UI Emoji" w:cs="Segoe UI Emoji"/>
+          <w:b/>
+          <w:bCs/>
+        </w:rPr>
+        <w:t>⏳</w:t>
       </w:r>
       <w:r>
         <w:rPr>
@@ -1148,6 +1476,21 @@
           <w:bCs/>
         </w:rPr>
         <w:t xml:space="preserve"> Retail Analytics Agent</w:t>
+      </w:r>
+    </w:p>
+    <w:p>
+      <w:pPr>
+        <w:rPr>
+          <w:b/>
+          <w:bCs/>
+        </w:rPr>
+      </w:pPr>
+      <w:r>
+        <w:rPr>
+          <w:b/>
+          <w:bCs/>
+        </w:rPr>
+        <w:t>└── Power BI Dashboard</w:t>
       </w:r>
     </w:p>
     <w:p>
@@ -1217,6 +1560,7 @@
         <w:rPr>
           <w:noProof/>
         </w:rPr>
+        <w:lastRenderedPageBreak/>
         <w:drawing>
           <wp:inline distT="0" distB="0" distL="0" distR="0" wp14:anchorId="2E72A0F6" wp14:editId="7DBB39A9">
             <wp:extent cx="5943600" cy="3679825"/>
@@ -1329,6 +1673,7 @@
         <w:rPr>
           <w:noProof/>
         </w:rPr>
+        <w:lastRenderedPageBreak/>
         <w:drawing>
           <wp:inline distT="0" distB="0" distL="0" distR="0" wp14:anchorId="38A29910" wp14:editId="180B98D9">
             <wp:extent cx="5943600" cy="2049145"/>
@@ -1425,7 +1770,6 @@
         <w:rPr>
           <w:noProof/>
         </w:rPr>
-        <w:lastRenderedPageBreak/>
         <w:drawing>
           <wp:inline distT="0" distB="0" distL="0" distR="0" wp14:anchorId="429CC9E2" wp14:editId="5CB532E5">
             <wp:extent cx="5943600" cy="2174240"/>
@@ -1474,6 +1818,7 @@
         <w:rPr>
           <w:noProof/>
         </w:rPr>
+        <w:lastRenderedPageBreak/>
         <w:drawing>
           <wp:inline distT="0" distB="0" distL="0" distR="0" wp14:anchorId="0B953274" wp14:editId="03F018C0">
             <wp:extent cx="5943600" cy="2005965"/>
@@ -1570,7 +1915,6 @@
         <w:rPr>
           <w:noProof/>
         </w:rPr>
-        <w:lastRenderedPageBreak/>
         <w:drawing>
           <wp:inline distT="0" distB="0" distL="0" distR="0" wp14:anchorId="50D8425F" wp14:editId="126C1071">
             <wp:extent cx="5943600" cy="2081530"/>
@@ -1667,6 +2011,7 @@
         <w:rPr>
           <w:noProof/>
         </w:rPr>
+        <w:lastRenderedPageBreak/>
         <w:drawing>
           <wp:inline distT="0" distB="0" distL="0" distR="0" wp14:anchorId="02CD5702" wp14:editId="48DB13C1">
             <wp:extent cx="5943600" cy="1965960"/>

</xml_diff>

<commit_message>
Completed Customer Churn Analytics and Demand Forecasting modules
</commit_message>
<xml_diff>
--- a/screenshots/03_Executive_Dashboard_Data_Prep.ipynb_Screenshots.docx
+++ b/screenshots/03_Executive_Dashboard_Data_Prep.ipynb_Screenshots.docx
@@ -60,6 +60,7 @@
         </w:rPr>
         <w:t>6</w:t>
       </w:r>
+      <w:proofErr w:type="gramStart"/>
       <w:r>
         <w:rPr>
           <w:b/>
@@ -87,7 +88,15 @@
           <w:b/>
           <w:bCs/>
         </w:rPr>
-        <w:t>Oct 2026</w:t>
+        <w:t>Oct</w:t>
+      </w:r>
+      <w:proofErr w:type="gramEnd"/>
+      <w:r>
+        <w:rPr>
+          <w:b/>
+          <w:bCs/>
+        </w:rPr>
+        <w:t xml:space="preserve"> 2026</w:t>
       </w:r>
       <w:r>
         <w:rPr>
@@ -963,14 +972,28 @@
           <w:b/>
           <w:bCs/>
         </w:rPr>
-        <w:t>⬜</w:t>
-      </w:r>
-      <w:r>
-        <w:rPr>
-          <w:b/>
-          <w:bCs/>
-        </w:rPr>
-        <w:t xml:space="preserve"> Customer Segmentation (RFM)</w:t>
+        <w:t>✅</w:t>
+      </w:r>
+      <w:r>
+        <w:rPr>
+          <w:b/>
+          <w:bCs/>
+        </w:rPr>
+        <w:t xml:space="preserve"> </w:t>
+      </w:r>
+      <w:r>
+        <w:rPr>
+          <w:b/>
+          <w:bCs/>
+        </w:rPr>
+        <w:t>Customer Segmentation (RFM)</w:t>
+      </w:r>
+      <w:r>
+        <w:rPr>
+          <w:b/>
+          <w:bCs/>
+        </w:rPr>
+        <w:t xml:space="preserve"> </w:t>
       </w:r>
     </w:p>
     <w:p>
@@ -1276,7 +1299,15 @@
           <w:b/>
           <w:bCs/>
         </w:rPr>
-        <w:t xml:space="preserve"> Phase 3 </w:t>
+        <w:t xml:space="preserve"> Phase </w:t>
+      </w:r>
+      <w:proofErr w:type="gramStart"/>
+      <w:r>
+        <w:rPr>
+          <w:b/>
+          <w:bCs/>
+        </w:rPr>
+        <w:t xml:space="preserve">3 </w:t>
       </w:r>
       <w:r>
         <w:rPr>
@@ -1291,7 +1322,15 @@
           <w:b/>
           <w:bCs/>
         </w:rPr>
-        <w:t xml:space="preserve"> Customer Segmentation (RFM)</w:t>
+        <w:t xml:space="preserve"> Customer</w:t>
+      </w:r>
+      <w:proofErr w:type="gramEnd"/>
+      <w:r>
+        <w:rPr>
+          <w:b/>
+          <w:bCs/>
+        </w:rPr>
+        <w:t xml:space="preserve"> Segmentation (RFM)</w:t>
       </w:r>
     </w:p>
     <w:p>
@@ -1322,7 +1361,15 @@
           <w:b/>
           <w:bCs/>
         </w:rPr>
-        <w:t xml:space="preserve"> Phase 4 </w:t>
+        <w:t xml:space="preserve"> Phase </w:t>
+      </w:r>
+      <w:proofErr w:type="gramStart"/>
+      <w:r>
+        <w:rPr>
+          <w:b/>
+          <w:bCs/>
+        </w:rPr>
+        <w:t xml:space="preserve">4 </w:t>
       </w:r>
       <w:r>
         <w:rPr>
@@ -1337,7 +1384,15 @@
           <w:b/>
           <w:bCs/>
         </w:rPr>
-        <w:t xml:space="preserve"> Customer Churn Analytics</w:t>
+        <w:t xml:space="preserve"> Customer</w:t>
+      </w:r>
+      <w:proofErr w:type="gramEnd"/>
+      <w:r>
+        <w:rPr>
+          <w:b/>
+          <w:bCs/>
+        </w:rPr>
+        <w:t xml:space="preserve"> Churn Analytics</w:t>
       </w:r>
     </w:p>
     <w:p>
@@ -1368,7 +1423,15 @@
           <w:b/>
           <w:bCs/>
         </w:rPr>
-        <w:t xml:space="preserve"> Phase 5 </w:t>
+        <w:t xml:space="preserve"> Phase </w:t>
+      </w:r>
+      <w:proofErr w:type="gramStart"/>
+      <w:r>
+        <w:rPr>
+          <w:b/>
+          <w:bCs/>
+        </w:rPr>
+        <w:t xml:space="preserve">5 </w:t>
       </w:r>
       <w:r>
         <w:rPr>
@@ -1383,7 +1446,15 @@
           <w:b/>
           <w:bCs/>
         </w:rPr>
-        <w:t xml:space="preserve"> Demand Forecasting</w:t>
+        <w:t xml:space="preserve"> Demand</w:t>
+      </w:r>
+      <w:proofErr w:type="gramEnd"/>
+      <w:r>
+        <w:rPr>
+          <w:b/>
+          <w:bCs/>
+        </w:rPr>
+        <w:t xml:space="preserve"> Forecasting</w:t>
       </w:r>
     </w:p>
     <w:p>
@@ -1414,7 +1485,15 @@
           <w:b/>
           <w:bCs/>
         </w:rPr>
-        <w:t xml:space="preserve"> Phase 6 </w:t>
+        <w:t xml:space="preserve"> Phase </w:t>
+      </w:r>
+      <w:proofErr w:type="gramStart"/>
+      <w:r>
+        <w:rPr>
+          <w:b/>
+          <w:bCs/>
+        </w:rPr>
+        <w:t xml:space="preserve">6 </w:t>
       </w:r>
       <w:r>
         <w:rPr>
@@ -1429,7 +1508,15 @@
           <w:b/>
           <w:bCs/>
         </w:rPr>
-        <w:t xml:space="preserve"> AI Retail Insights</w:t>
+        <w:t xml:space="preserve"> AI</w:t>
+      </w:r>
+      <w:proofErr w:type="gramEnd"/>
+      <w:r>
+        <w:rPr>
+          <w:b/>
+          <w:bCs/>
+        </w:rPr>
+        <w:t xml:space="preserve"> Retail Insights</w:t>
       </w:r>
     </w:p>
     <w:p>
@@ -1460,7 +1547,15 @@
           <w:b/>
           <w:bCs/>
         </w:rPr>
-        <w:t xml:space="preserve"> Phase 7 </w:t>
+        <w:t xml:space="preserve"> Phase </w:t>
+      </w:r>
+      <w:proofErr w:type="gramStart"/>
+      <w:r>
+        <w:rPr>
+          <w:b/>
+          <w:bCs/>
+        </w:rPr>
+        <w:t xml:space="preserve">7 </w:t>
       </w:r>
       <w:r>
         <w:rPr>
@@ -1475,7 +1570,15 @@
           <w:b/>
           <w:bCs/>
         </w:rPr>
-        <w:t xml:space="preserve"> Retail Analytics Agent</w:t>
+        <w:t xml:space="preserve"> Retail</w:t>
+      </w:r>
+      <w:proofErr w:type="gramEnd"/>
+      <w:r>
+        <w:rPr>
+          <w:b/>
+          <w:bCs/>
+        </w:rPr>
+        <w:t xml:space="preserve"> Analytics Agent</w:t>
       </w:r>
     </w:p>
     <w:p>
@@ -2663,6 +2766,7 @@
   <w:style w:type="character" w:default="1" w:styleId="DefaultParagraphFont">
     <w:name w:val="Default Paragraph Font"/>
     <w:uiPriority w:val="1"/>
+    <w:semiHidden/>
     <w:unhideWhenUsed/>
   </w:style>
   <w:style w:type="table" w:default="1" w:styleId="TableNormal">

</xml_diff>